<commit_message>
last session with project
</commit_message>
<xml_diff>
--- a/Regex-Assignment.docx
+++ b/Regex-Assignment.docx
@@ -31,21 +31,7 @@
         <w:rPr>
           <w:lang w:val="en-US"/>
         </w:rPr>
-        <w:t xml:space="preserve">Create a registration form with </w:t>
-      </w:r>
-      <w:proofErr w:type="gramStart"/>
-      <w:r>
-        <w:rPr>
-          <w:lang w:val="en-US"/>
-        </w:rPr>
-        <w:t>fields</w:t>
-      </w:r>
-      <w:proofErr w:type="gramEnd"/>
-      <w:r>
-        <w:rPr>
-          <w:lang w:val="en-US"/>
-        </w:rPr>
-        <w:t xml:space="preserve"> as:</w:t>
+        <w:t>Create a registration form with fields as:</w:t>
       </w:r>
     </w:p>
     <w:p>
@@ -95,14 +81,12 @@
           <w:lang w:val="en-US"/>
         </w:rPr>
       </w:pPr>
-      <w:proofErr w:type="spellStart"/>
       <w:r>
         <w:rPr>
           <w:lang w:val="en-US"/>
         </w:rPr>
         <w:t>phoneNum</w:t>
       </w:r>
-      <w:proofErr w:type="spellEnd"/>
     </w:p>
     <w:p>
       <w:pPr>
@@ -119,21 +103,7 @@
         <w:rPr>
           <w:lang w:val="en-US"/>
         </w:rPr>
-        <w:t xml:space="preserve">password   - minimum length </w:t>
-      </w:r>
-      <w:proofErr w:type="spellStart"/>
-      <w:r>
-        <w:rPr>
-          <w:lang w:val="en-US"/>
-        </w:rPr>
-        <w:t>dhould</w:t>
-      </w:r>
-      <w:proofErr w:type="spellEnd"/>
-      <w:r>
-        <w:rPr>
-          <w:lang w:val="en-US"/>
-        </w:rPr>
-        <w:t xml:space="preserve"> be 6 characters, one capital letter, one number, a special character</w:t>
+        <w:t>password   - minimum length dhould be 6 characters, one capital letter, one number, a special character</w:t>
       </w:r>
     </w:p>
     <w:p>
@@ -147,14 +117,12 @@
           <w:lang w:val="en-US"/>
         </w:rPr>
       </w:pPr>
-      <w:proofErr w:type="spellStart"/>
       <w:r>
         <w:rPr>
           <w:lang w:val="en-US"/>
         </w:rPr>
         <w:t>confirmPassword</w:t>
       </w:r>
-      <w:proofErr w:type="spellEnd"/>
     </w:p>
     <w:p>
       <w:pPr>
@@ -192,21 +160,7 @@
         <w:rPr>
           <w:lang w:val="en-US"/>
         </w:rPr>
-        <w:t xml:space="preserve">Phone </w:t>
-      </w:r>
-      <w:proofErr w:type="gramStart"/>
-      <w:r>
-        <w:rPr>
-          <w:lang w:val="en-US"/>
-        </w:rPr>
-        <w:t>number</w:t>
-      </w:r>
-      <w:proofErr w:type="gramEnd"/>
-      <w:r>
-        <w:rPr>
-          <w:lang w:val="en-US"/>
-        </w:rPr>
-        <w:t xml:space="preserve"> should contain only digits.</w:t>
+        <w:t>Phone number should contain only digits.</w:t>
       </w:r>
     </w:p>
     <w:p>
@@ -219,21 +173,7 @@
         <w:rPr>
           <w:lang w:val="en-US"/>
         </w:rPr>
-        <w:t xml:space="preserve">Password and </w:t>
-      </w:r>
-      <w:proofErr w:type="spellStart"/>
-      <w:r>
-        <w:rPr>
-          <w:lang w:val="en-US"/>
-        </w:rPr>
-        <w:t>confirmPassword</w:t>
-      </w:r>
-      <w:proofErr w:type="spellEnd"/>
-      <w:r>
-        <w:rPr>
-          <w:lang w:val="en-US"/>
-        </w:rPr>
-        <w:t xml:space="preserve"> should match</w:t>
+        <w:t>Password and confirmPassword should match</w:t>
       </w:r>
     </w:p>
     <w:p>
@@ -242,6 +182,25 @@
           <w:lang w:val="en-US"/>
         </w:rPr>
       </w:pPr>
+      <w:r>
+        <w:rPr>
+          <w:lang w:val="en-US"/>
+        </w:rPr>
+        <w:t>Write a validate method to validate the form input and invoke it on a button click</w:t>
+      </w:r>
+    </w:p>
+    <w:p>
+      <w:pPr>
+        <w:rPr>
+          <w:lang w:val="en-US"/>
+        </w:rPr>
+      </w:pPr>
+      <w:r>
+        <w:rPr>
+          <w:lang w:val="en-US"/>
+        </w:rPr>
+        <w:t>DO NOT USE HTML5 VALIDATIONS.</w:t>
+      </w:r>
     </w:p>
     <w:p>
       <w:pPr>

</xml_diff>